<commit_message>
PPT y documentación final
</commit_message>
<xml_diff>
--- a/FASE 1/Evidencias Grupales/1.5_GuiaEstudiante_Fase 1_Definicion Proyecto APT (SISTEMA PARA TRANSPORTE).docx
+++ b/FASE 1/Evidencias Grupales/1.5_GuiaEstudiante_Fase 1_Definicion Proyecto APT (SISTEMA PARA TRANSPORTE).docx
@@ -128,15 +128,7 @@
                                     <w:color w:val="1F3864"/>
                                     <w:sz w:val="48"/>
                                   </w:rPr>
-                                  <w:t xml:space="preserve">Asignatura </w:t>
-                                </w:r>
-                                <w:r>
-                                  <w:rPr>
-                                    <w:b/>
-                                    <w:color w:val="1F3864"/>
-                                    <w:sz w:val="48"/>
-                                  </w:rPr>
-                                  <w:t>Capstone</w:t>
+                                  <w:t>Asignatura Capstone</w:t>
                                 </w:r>
                               </w:p>
                             </w:txbxContent>
@@ -234,15 +226,7 @@
                               <w:color w:val="1F3864"/>
                               <w:sz w:val="48"/>
                             </w:rPr>
-                            <w:t xml:space="preserve">Asignatura </w:t>
-                          </w:r>
-                          <w:r>
-                            <w:rPr>
-                              <w:b/>
-                              <w:color w:val="1F3864"/>
-                              <w:sz w:val="48"/>
-                            </w:rPr>
-                            <w:t>Capstone</w:t>
+                            <w:t>Asignatura Capstone</w:t>
                           </w:r>
                         </w:p>
                       </w:txbxContent>
@@ -1333,27 +1317,7 @@
                 <w:sz w:val="20"/>
                 <w:szCs w:val="20"/>
               </w:rPr>
-              <w:t xml:space="preserve">La solución contempla una plataforma web para la gestión administrativa, la planificación de rutas y la visualización de indicadores mediante un </w:t>
-            </w:r>
-            <w:proofErr w:type="spellStart"/>
-            <w:r>
-              <w:rPr>
-                <w:i/>
-                <w:iCs/>
-                <w:sz w:val="20"/>
-                <w:szCs w:val="20"/>
-              </w:rPr>
-              <w:t>dashboard</w:t>
-            </w:r>
-            <w:proofErr w:type="spellEnd"/>
-            <w:r>
-              <w:rPr>
-                <w:i/>
-                <w:iCs/>
-                <w:sz w:val="20"/>
-                <w:szCs w:val="20"/>
-              </w:rPr>
-              <w:t>. Además, considera una aplicación móvil para conductores y pasajeros, que permita consultar información de los servicios y registrar la asistencia efectiva mediante códigos QR generados por el conductor y escaneados por los pasajeros.</w:t>
+              <w:t>La solución contempla una plataforma web para la gestión administrativa, la planificación de rutas y la visualización de indicadores mediante un dashboard. Además, considera una aplicación móvil para conductores y pasajeros, que permita consultar información de los servicios y registrar la asistencia efectiva mediante códigos QR generados por el conductor y escaneados por los pasajeros.</w:t>
             </w:r>
           </w:p>
           <w:p>
@@ -2003,27 +1967,7 @@
                 <w:sz w:val="20"/>
                 <w:szCs w:val="20"/>
               </w:rPr>
-              <w:t xml:space="preserve"> una plataforma web administrativa que permita gestionar la operación y visualizar indicadores mediante un </w:t>
-            </w:r>
-            <w:proofErr w:type="spellStart"/>
-            <w:r>
-              <w:rPr>
-                <w:i/>
-                <w:iCs/>
-                <w:sz w:val="20"/>
-                <w:szCs w:val="20"/>
-              </w:rPr>
-              <w:t>dashboard</w:t>
-            </w:r>
-            <w:proofErr w:type="spellEnd"/>
-            <w:r>
-              <w:rPr>
-                <w:i/>
-                <w:iCs/>
-                <w:sz w:val="20"/>
-                <w:szCs w:val="20"/>
-              </w:rPr>
-              <w:t>.</w:t>
+              <w:t xml:space="preserve"> una plataforma web administrativa que permita gestionar la operación y visualizar indicadores mediante un dashboard.</w:t>
             </w:r>
           </w:p>
           <w:p>
@@ -2344,19 +2288,20 @@
                 <w:sz w:val="18"/>
                 <w:szCs w:val="18"/>
               </w:rPr>
-              <w:t xml:space="preserve">La gestión del proyecto se realizará mediante un tablero Kanban en </w:t>
-            </w:r>
-            <w:proofErr w:type="spellStart"/>
-            <w:r>
+              <w:t>La gestión del proyecto se realizará mediante un tablero Kanban en Notion, utilizando los estados Pendiente, En desarrollo, En revisión y Finalizado. Cada actividad tendrá una responsable, prioridad y fecha asociada, permitiendo mantener la trazabilidad del trabajo realizado durante el semestre.</w:t>
+            </w:r>
+          </w:p>
+          <w:p>
+            <w:pPr>
+              <w:spacing w:before="240" w:after="240"/>
+              <w:jc w:val="both"/>
               <w:rPr>
                 <w:i/>
                 <w:iCs/>
                 <w:sz w:val="18"/>
                 <w:szCs w:val="18"/>
               </w:rPr>
-              <w:t>Notion</w:t>
-            </w:r>
-            <w:proofErr w:type="spellEnd"/>
+            </w:pPr>
             <w:r>
               <w:rPr>
                 <w:i/>
@@ -2364,7 +2309,7 @@
                 <w:sz w:val="18"/>
                 <w:szCs w:val="18"/>
               </w:rPr>
-              <w:t>, utilizando los estados Pendiente, En desarrollo, En revisión y Finalizado. Cada actividad tendrá una responsable, prioridad y fecha asociada, permitiendo mantener la trazabilidad del trabajo realizado durante el semestre.</w:t>
+              <w:t>El proyecto se desarrollará mediante las etapas de levantamiento y análisis de requerimientos, diseño, desarrollo, integración, pruebas y validación, priorizando inicialmente las funcionalidades necesarias para obtener un producto mínimo viable.</w:t>
             </w:r>
           </w:p>
           <w:p>
@@ -2385,7 +2330,7 @@
                 <w:sz w:val="18"/>
                 <w:szCs w:val="18"/>
               </w:rPr>
-              <w:t>El proyecto se desarrollará mediante las etapas de levantamiento y análisis de requerimientos, diseño, desarrollo, integración, pruebas y validación, priorizando inicialmente las funcionalidades necesarias para obtener un producto mínimo viable.</w:t>
+              <w:t>Las responsabilidades se dividirán por componentes. Angelina Mendoza estará a cargo de la documentación y trazabilidad de requerimientos, desarrollo de la plataforma web administrativa y dashboard. La segunda integrante estará a cargo del desarrollo de la aplicación móvil orientada a conductores y pasajeros. El backend, API y base de datos se dividirán por módulos funcionales, asignando cada módulo a una única responsable para evitar duplicidad en el desarrollo.</w:t>
             </w:r>
           </w:p>
           <w:p>
@@ -2406,88 +2351,7 @@
                 <w:sz w:val="18"/>
                 <w:szCs w:val="18"/>
               </w:rPr>
-              <w:t xml:space="preserve">Las responsabilidades se dividirán por componentes. Angelina Mendoza estará a cargo de la documentación y trazabilidad de requerimientos, desarrollo de la plataforma web administrativa y </w:t>
-            </w:r>
-            <w:proofErr w:type="spellStart"/>
-            <w:r>
-              <w:rPr>
-                <w:i/>
-                <w:iCs/>
-                <w:sz w:val="18"/>
-                <w:szCs w:val="18"/>
-              </w:rPr>
-              <w:t>dashboard</w:t>
-            </w:r>
-            <w:proofErr w:type="spellEnd"/>
-            <w:r>
-              <w:rPr>
-                <w:i/>
-                <w:iCs/>
-                <w:sz w:val="18"/>
-                <w:szCs w:val="18"/>
-              </w:rPr>
-              <w:t xml:space="preserve">. La segunda integrante estará a cargo del desarrollo de la aplicación móvil orientada a conductores y pasajeros. El </w:t>
-            </w:r>
-            <w:proofErr w:type="spellStart"/>
-            <w:r>
-              <w:rPr>
-                <w:i/>
-                <w:iCs/>
-                <w:sz w:val="18"/>
-                <w:szCs w:val="18"/>
-              </w:rPr>
-              <w:t>backend</w:t>
-            </w:r>
-            <w:proofErr w:type="spellEnd"/>
-            <w:r>
-              <w:rPr>
-                <w:i/>
-                <w:iCs/>
-                <w:sz w:val="18"/>
-                <w:szCs w:val="18"/>
-              </w:rPr>
-              <w:t>, API y base de datos se dividirán por módulos funcionales, asignando cada módulo a una única responsable para evitar duplicidad en el desarrollo.</w:t>
-            </w:r>
-          </w:p>
-          <w:p>
-            <w:pPr>
-              <w:spacing w:before="240" w:after="240"/>
-              <w:jc w:val="both"/>
-              <w:rPr>
-                <w:i/>
-                <w:iCs/>
-                <w:sz w:val="18"/>
-                <w:szCs w:val="18"/>
-              </w:rPr>
-            </w:pPr>
-            <w:r>
-              <w:rPr>
-                <w:i/>
-                <w:iCs/>
-                <w:sz w:val="18"/>
-                <w:szCs w:val="18"/>
-              </w:rPr>
-              <w:t xml:space="preserve">Las actividades de arquitectura general, integración de los componentes y pruebas integrales serán realizadas de manera colaborativa, manteniendo el desarrollo de cada funcionalidad bajo la responsabilidad individual previamente definida en </w:t>
-            </w:r>
-            <w:proofErr w:type="spellStart"/>
-            <w:r>
-              <w:rPr>
-                <w:i/>
-                <w:iCs/>
-                <w:sz w:val="18"/>
-                <w:szCs w:val="18"/>
-              </w:rPr>
-              <w:t>Notion</w:t>
-            </w:r>
-            <w:proofErr w:type="spellEnd"/>
-            <w:r>
-              <w:rPr>
-                <w:i/>
-                <w:iCs/>
-                <w:sz w:val="18"/>
-                <w:szCs w:val="18"/>
-              </w:rPr>
-              <w:t>.</w:t>
+              <w:t>Las actividades de arquitectura general, integración de los componentes y pruebas integrales serán realizadas de manera colaborativa, manteniendo el desarrollo de cada funcionalidad bajo la responsabilidad individual previamente definida en Notion.</w:t>
             </w:r>
           </w:p>
           <w:p>
@@ -2509,27 +2373,7 @@
                 <w:sz w:val="18"/>
                 <w:szCs w:val="18"/>
               </w:rPr>
-              <w:t xml:space="preserve">El uso de Kanban y </w:t>
-            </w:r>
-            <w:proofErr w:type="spellStart"/>
-            <w:r>
-              <w:rPr>
-                <w:i/>
-                <w:iCs/>
-                <w:sz w:val="18"/>
-                <w:szCs w:val="18"/>
-              </w:rPr>
-              <w:t>Notion</w:t>
-            </w:r>
-            <w:proofErr w:type="spellEnd"/>
-            <w:r>
-              <w:rPr>
-                <w:i/>
-                <w:iCs/>
-                <w:sz w:val="18"/>
-                <w:szCs w:val="18"/>
-              </w:rPr>
-              <w:t xml:space="preserve"> permitirá controlar el avance, visualizar tareas pendientes o bloqueadas, gestionar prioridades y mantener evidencia de las actividades desarrolladas por cada integrante.</w:t>
+              <w:t>El uso de Kanban y Notion permitirá controlar el avance, visualizar tareas pendientes o bloqueadas, gestionar prioridades y mantener evidencia de las actividades desarrolladas por cada integrante.</w:t>
             </w:r>
           </w:p>
         </w:tc>
@@ -3673,19 +3517,11 @@
                 <w:color w:val="1F3864"/>
               </w:rPr>
             </w:pPr>
-            <w:proofErr w:type="spellStart"/>
-            <w:r>
-              <w:rPr>
-                <w:color w:val="1F3864"/>
-              </w:rPr>
-              <w:t>Dashboard</w:t>
-            </w:r>
-            <w:proofErr w:type="spellEnd"/>
-            <w:r>
-              <w:rPr>
-                <w:color w:val="1F3864"/>
-              </w:rPr>
-              <w:t>, reportes y planilla mensual</w:t>
+            <w:r>
+              <w:rPr>
+                <w:color w:val="1F3864"/>
+              </w:rPr>
+              <w:t>Dashboard, reportes y planilla mensual</w:t>
             </w:r>
           </w:p>
         </w:tc>
@@ -3998,21 +3834,7 @@
               <w:rPr>
                 <w:color w:val="1F3864"/>
               </w:rPr>
-              <w:t xml:space="preserve">En la siguiente tabla define la planificación de tu Proyecto APT </w:t>
-            </w:r>
-            <w:proofErr w:type="gramStart"/>
-            <w:r>
-              <w:rPr>
-                <w:color w:val="1F3864"/>
-              </w:rPr>
-              <w:t>de acuerdo a</w:t>
-            </w:r>
-            <w:proofErr w:type="gramEnd"/>
-            <w:r>
-              <w:rPr>
-                <w:color w:val="1F3864"/>
-              </w:rPr>
-              <w:t xml:space="preserve"> lo requerido.</w:t>
+              <w:t>En la siguiente tabla define la planificación de tu Proyecto APT de acuerdo a lo requerido.</w:t>
             </w:r>
           </w:p>
         </w:tc>
@@ -4403,27 +4225,7 @@
                 <w:sz w:val="18"/>
                 <w:szCs w:val="18"/>
               </w:rPr>
-              <w:t xml:space="preserve">Entrevistas, reuniones, </w:t>
-            </w:r>
-            <w:proofErr w:type="spellStart"/>
-            <w:r>
-              <w:rPr>
-                <w:rFonts w:asciiTheme="minorHAnsi" w:eastAsia="Times New Roman" w:hAnsiTheme="minorHAnsi" w:cstheme="minorHAnsi"/>
-                <w:color w:val="002060"/>
-                <w:sz w:val="18"/>
-                <w:szCs w:val="18"/>
-              </w:rPr>
-              <w:t>Notion</w:t>
-            </w:r>
-            <w:proofErr w:type="spellEnd"/>
-            <w:r>
-              <w:rPr>
-                <w:rFonts w:asciiTheme="minorHAnsi" w:eastAsia="Times New Roman" w:hAnsiTheme="minorHAnsi" w:cstheme="minorHAnsi"/>
-                <w:color w:val="002060"/>
-                <w:sz w:val="18"/>
-                <w:szCs w:val="18"/>
-              </w:rPr>
-              <w:t>, documentación APT</w:t>
+              <w:t>Entrevistas, reuniones, Notion, documentación APT</w:t>
             </w:r>
           </w:p>
         </w:tc>
@@ -4616,25 +4418,14 @@
                 <w:szCs w:val="18"/>
               </w:rPr>
             </w:pPr>
-            <w:proofErr w:type="spellStart"/>
-            <w:r>
-              <w:rPr>
-                <w:rFonts w:asciiTheme="minorHAnsi" w:eastAsia="Times New Roman" w:hAnsiTheme="minorHAnsi" w:cstheme="minorHAnsi"/>
-                <w:color w:val="002060"/>
-                <w:sz w:val="18"/>
-                <w:szCs w:val="18"/>
-              </w:rPr>
-              <w:t>Notion</w:t>
-            </w:r>
-            <w:proofErr w:type="spellEnd"/>
-            <w:r>
-              <w:rPr>
-                <w:rFonts w:asciiTheme="minorHAnsi" w:eastAsia="Times New Roman" w:hAnsiTheme="minorHAnsi" w:cstheme="minorHAnsi"/>
-                <w:color w:val="002060"/>
-                <w:sz w:val="18"/>
-                <w:szCs w:val="18"/>
-              </w:rPr>
-              <w:t>, documentación, información levantada</w:t>
+            <w:r>
+              <w:rPr>
+                <w:rFonts w:asciiTheme="minorHAnsi" w:eastAsia="Times New Roman" w:hAnsiTheme="minorHAnsi" w:cstheme="minorHAnsi"/>
+                <w:color w:val="002060"/>
+                <w:sz w:val="18"/>
+                <w:szCs w:val="18"/>
+              </w:rPr>
+              <w:t>Notion, documentación, información levantada</w:t>
             </w:r>
           </w:p>
         </w:tc>
@@ -4827,25 +4618,14 @@
                 <w:szCs w:val="18"/>
               </w:rPr>
             </w:pPr>
-            <w:proofErr w:type="spellStart"/>
-            <w:r>
-              <w:rPr>
-                <w:rFonts w:asciiTheme="minorHAnsi" w:eastAsia="Times New Roman" w:hAnsiTheme="minorHAnsi" w:cstheme="minorHAnsi"/>
-                <w:color w:val="002060"/>
-                <w:sz w:val="18"/>
-                <w:szCs w:val="18"/>
-              </w:rPr>
-              <w:t>Notion</w:t>
-            </w:r>
-            <w:proofErr w:type="spellEnd"/>
-            <w:r>
-              <w:rPr>
-                <w:rFonts w:asciiTheme="minorHAnsi" w:eastAsia="Times New Roman" w:hAnsiTheme="minorHAnsi" w:cstheme="minorHAnsi"/>
-                <w:color w:val="002060"/>
-                <w:sz w:val="18"/>
-                <w:szCs w:val="18"/>
-              </w:rPr>
-              <w:t>, Kanban, cronograma</w:t>
+            <w:r>
+              <w:rPr>
+                <w:rFonts w:asciiTheme="minorHAnsi" w:eastAsia="Times New Roman" w:hAnsiTheme="minorHAnsi" w:cstheme="minorHAnsi"/>
+                <w:color w:val="002060"/>
+                <w:sz w:val="18"/>
+                <w:szCs w:val="18"/>
+              </w:rPr>
+              <w:t>Notion, Kanban, cronograma</w:t>
             </w:r>
           </w:p>
         </w:tc>
@@ -5040,27 +4820,7 @@
                 <w:sz w:val="18"/>
                 <w:szCs w:val="18"/>
               </w:rPr>
-              <w:t xml:space="preserve">Definir la arquitectura general y la comunicación entre plataforma web, aplicación móvil, </w:t>
-            </w:r>
-            <w:proofErr w:type="spellStart"/>
-            <w:r>
-              <w:rPr>
-                <w:rFonts w:asciiTheme="minorHAnsi" w:eastAsia="Times New Roman" w:hAnsiTheme="minorHAnsi" w:cstheme="minorHAnsi"/>
-                <w:color w:val="002060"/>
-                <w:sz w:val="18"/>
-                <w:szCs w:val="18"/>
-              </w:rPr>
-              <w:t>backend</w:t>
-            </w:r>
-            <w:proofErr w:type="spellEnd"/>
-            <w:r>
-              <w:rPr>
-                <w:rFonts w:asciiTheme="minorHAnsi" w:eastAsia="Times New Roman" w:hAnsiTheme="minorHAnsi" w:cstheme="minorHAnsi"/>
-                <w:color w:val="002060"/>
-                <w:sz w:val="18"/>
-                <w:szCs w:val="18"/>
-              </w:rPr>
-              <w:t xml:space="preserve"> y bases de datos relacional y no relacional.</w:t>
+              <w:t>Definir la arquitectura general y la comunicación entre plataforma web, aplicación móvil, backend y bases de datos relacional y no relacional.</w:t>
             </w:r>
           </w:p>
         </w:tc>
@@ -5087,27 +4847,7 @@
                 <w:sz w:val="18"/>
                 <w:szCs w:val="18"/>
               </w:rPr>
-              <w:t xml:space="preserve">Diagramas, </w:t>
-            </w:r>
-            <w:proofErr w:type="spellStart"/>
-            <w:r>
-              <w:rPr>
-                <w:rFonts w:asciiTheme="minorHAnsi" w:eastAsia="Times New Roman" w:hAnsiTheme="minorHAnsi" w:cstheme="minorHAnsi"/>
-                <w:color w:val="002060"/>
-                <w:sz w:val="18"/>
-                <w:szCs w:val="18"/>
-              </w:rPr>
-              <w:t>Figma</w:t>
-            </w:r>
-            <w:proofErr w:type="spellEnd"/>
-            <w:r>
-              <w:rPr>
-                <w:rFonts w:asciiTheme="minorHAnsi" w:eastAsia="Times New Roman" w:hAnsiTheme="minorHAnsi" w:cstheme="minorHAnsi"/>
-                <w:color w:val="002060"/>
-                <w:sz w:val="18"/>
-                <w:szCs w:val="18"/>
-              </w:rPr>
-              <w:t>, documentación técnica</w:t>
+              <w:t>Diagramas, Figma, documentación técnica</w:t>
             </w:r>
           </w:p>
         </w:tc>
@@ -5300,7 +5040,6 @@
                 <w:szCs w:val="18"/>
               </w:rPr>
             </w:pPr>
-            <w:proofErr w:type="spellStart"/>
             <w:r>
               <w:rPr>
                 <w:rFonts w:asciiTheme="minorHAnsi" w:eastAsia="Times New Roman" w:hAnsiTheme="minorHAnsi" w:cstheme="minorHAnsi"/>
@@ -5310,7 +5049,6 @@
               </w:rPr>
               <w:t>Figma</w:t>
             </w:r>
-            <w:proofErr w:type="spellEnd"/>
           </w:p>
         </w:tc>
         <w:tc>
@@ -5910,31 +5648,7 @@
                 <w:sz w:val="18"/>
                 <w:szCs w:val="18"/>
               </w:rPr>
-              <w:t xml:space="preserve">Desarrollo del </w:t>
-            </w:r>
-            <w:proofErr w:type="spellStart"/>
-            <w:r>
-              <w:rPr>
-                <w:rFonts w:asciiTheme="minorHAnsi" w:eastAsia="Times New Roman" w:hAnsiTheme="minorHAnsi" w:cstheme="minorHAnsi"/>
-                <w:b/>
-                <w:bCs/>
-                <w:color w:val="002060"/>
-                <w:sz w:val="18"/>
-                <w:szCs w:val="18"/>
-              </w:rPr>
-              <w:t>backend</w:t>
-            </w:r>
-            <w:proofErr w:type="spellEnd"/>
-            <w:r>
-              <w:rPr>
-                <w:rFonts w:asciiTheme="minorHAnsi" w:eastAsia="Times New Roman" w:hAnsiTheme="minorHAnsi" w:cstheme="minorHAnsi"/>
-                <w:b/>
-                <w:bCs/>
-                <w:color w:val="002060"/>
-                <w:sz w:val="18"/>
-                <w:szCs w:val="18"/>
-              </w:rPr>
-              <w:t xml:space="preserve"> y API REST</w:t>
+              <w:t>Desarrollo del backend y API REST</w:t>
             </w:r>
           </w:p>
         </w:tc>
@@ -6071,27 +5785,7 @@
                 <w:sz w:val="18"/>
                 <w:szCs w:val="18"/>
               </w:rPr>
-              <w:t xml:space="preserve">Angelina tendrá participación principal en </w:t>
-            </w:r>
-            <w:proofErr w:type="spellStart"/>
-            <w:r>
-              <w:rPr>
-                <w:rFonts w:asciiTheme="minorHAnsi" w:eastAsia="Times New Roman" w:hAnsiTheme="minorHAnsi" w:cstheme="minorHAnsi"/>
-                <w:color w:val="002060"/>
-                <w:sz w:val="18"/>
-                <w:szCs w:val="18"/>
-              </w:rPr>
-              <w:t>backend</w:t>
-            </w:r>
-            <w:proofErr w:type="spellEnd"/>
-            <w:r>
-              <w:rPr>
-                <w:rFonts w:asciiTheme="minorHAnsi" w:eastAsia="Times New Roman" w:hAnsiTheme="minorHAnsi" w:cstheme="minorHAnsi"/>
-                <w:color w:val="002060"/>
-                <w:sz w:val="18"/>
-                <w:szCs w:val="18"/>
-              </w:rPr>
-              <w:t>, distribuyendo algunos módulos entre ambas integrantes.</w:t>
+              <w:t>Angelina tendrá participación principal en backend, distribuyendo algunos módulos entre ambas integrantes.</w:t>
             </w:r>
           </w:p>
         </w:tc>
@@ -6208,27 +5902,7 @@
                 <w:sz w:val="18"/>
                 <w:szCs w:val="18"/>
               </w:rPr>
-              <w:t xml:space="preserve">Angular, </w:t>
-            </w:r>
-            <w:proofErr w:type="spellStart"/>
-            <w:r>
-              <w:rPr>
-                <w:rFonts w:asciiTheme="minorHAnsi" w:eastAsia="Times New Roman" w:hAnsiTheme="minorHAnsi" w:cstheme="minorHAnsi"/>
-                <w:color w:val="002060"/>
-                <w:sz w:val="18"/>
-                <w:szCs w:val="18"/>
-              </w:rPr>
-              <w:t>TypeScript</w:t>
-            </w:r>
-            <w:proofErr w:type="spellEnd"/>
-            <w:r>
-              <w:rPr>
-                <w:rFonts w:asciiTheme="minorHAnsi" w:eastAsia="Times New Roman" w:hAnsiTheme="minorHAnsi" w:cstheme="minorHAnsi"/>
-                <w:color w:val="002060"/>
-                <w:sz w:val="18"/>
-                <w:szCs w:val="18"/>
-              </w:rPr>
-              <w:t>, HTML, CSS, API REST, GitHub</w:t>
+              <w:t>Angular, TypeScript, HTML, CSS, API REST, GitHub</w:t>
             </w:r>
           </w:p>
         </w:tc>
@@ -6421,25 +6095,14 @@
                 <w:szCs w:val="18"/>
               </w:rPr>
             </w:pPr>
-            <w:proofErr w:type="spellStart"/>
-            <w:r>
-              <w:rPr>
-                <w:rFonts w:asciiTheme="minorHAnsi" w:eastAsia="Times New Roman" w:hAnsiTheme="minorHAnsi" w:cstheme="minorHAnsi"/>
-                <w:color w:val="002060"/>
-                <w:sz w:val="18"/>
-                <w:szCs w:val="18"/>
-              </w:rPr>
-              <w:t>Ionic</w:t>
-            </w:r>
-            <w:proofErr w:type="spellEnd"/>
-            <w:r>
-              <w:rPr>
-                <w:rFonts w:asciiTheme="minorHAnsi" w:eastAsia="Times New Roman" w:hAnsiTheme="minorHAnsi" w:cstheme="minorHAnsi"/>
-                <w:color w:val="002060"/>
-                <w:sz w:val="18"/>
-                <w:szCs w:val="18"/>
-              </w:rPr>
-              <w:t>, Angular, Capacitor, Android Studio, API REST, GitHub</w:t>
+            <w:r>
+              <w:rPr>
+                <w:rFonts w:asciiTheme="minorHAnsi" w:eastAsia="Times New Roman" w:hAnsiTheme="minorHAnsi" w:cstheme="minorHAnsi"/>
+                <w:color w:val="002060"/>
+                <w:sz w:val="18"/>
+                <w:szCs w:val="18"/>
+              </w:rPr>
+              <w:t>Ionic, Angular, Capacitor, Android Studio, API REST, GitHub</w:t>
             </w:r>
           </w:p>
         </w:tc>
@@ -6660,27 +6323,7 @@
                 <w:sz w:val="18"/>
                 <w:szCs w:val="18"/>
               </w:rPr>
-              <w:t xml:space="preserve">Angular, </w:t>
-            </w:r>
-            <w:proofErr w:type="spellStart"/>
-            <w:r>
-              <w:rPr>
-                <w:rFonts w:asciiTheme="minorHAnsi" w:eastAsia="Times New Roman" w:hAnsiTheme="minorHAnsi" w:cstheme="minorHAnsi"/>
-                <w:color w:val="002060"/>
-                <w:sz w:val="18"/>
-                <w:szCs w:val="18"/>
-              </w:rPr>
-              <w:t>Ionic</w:t>
-            </w:r>
-            <w:proofErr w:type="spellEnd"/>
-            <w:r>
-              <w:rPr>
-                <w:rFonts w:asciiTheme="minorHAnsi" w:eastAsia="Times New Roman" w:hAnsiTheme="minorHAnsi" w:cstheme="minorHAnsi"/>
-                <w:color w:val="002060"/>
-                <w:sz w:val="18"/>
-                <w:szCs w:val="18"/>
-              </w:rPr>
-              <w:t>, librería QR, API REST, bases de datos</w:t>
+              <w:t>Angular, Ionic, librería QR, API REST, bases de datos</w:t>
             </w:r>
           </w:p>
         </w:tc>
@@ -6763,47 +6406,7 @@
                 <w:sz w:val="18"/>
                 <w:szCs w:val="18"/>
               </w:rPr>
-              <w:t xml:space="preserve">Requiere integración entre </w:t>
-            </w:r>
-            <w:proofErr w:type="gramStart"/>
-            <w:r>
-              <w:rPr>
-                <w:rFonts w:asciiTheme="minorHAnsi" w:eastAsia="Times New Roman" w:hAnsiTheme="minorHAnsi" w:cstheme="minorHAnsi"/>
-                <w:color w:val="002060"/>
-                <w:sz w:val="18"/>
-                <w:szCs w:val="18"/>
-              </w:rPr>
-              <w:t>app</w:t>
-            </w:r>
-            <w:proofErr w:type="gramEnd"/>
-            <w:r>
-              <w:rPr>
-                <w:rFonts w:asciiTheme="minorHAnsi" w:eastAsia="Times New Roman" w:hAnsiTheme="minorHAnsi" w:cstheme="minorHAnsi"/>
-                <w:color w:val="002060"/>
-                <w:sz w:val="18"/>
-                <w:szCs w:val="18"/>
-              </w:rPr>
-              <w:t xml:space="preserve"> móvil, </w:t>
-            </w:r>
-            <w:proofErr w:type="spellStart"/>
-            <w:r>
-              <w:rPr>
-                <w:rFonts w:asciiTheme="minorHAnsi" w:eastAsia="Times New Roman" w:hAnsiTheme="minorHAnsi" w:cstheme="minorHAnsi"/>
-                <w:color w:val="002060"/>
-                <w:sz w:val="18"/>
-                <w:szCs w:val="18"/>
-              </w:rPr>
-              <w:t>backend</w:t>
-            </w:r>
-            <w:proofErr w:type="spellEnd"/>
-            <w:r>
-              <w:rPr>
-                <w:rFonts w:asciiTheme="minorHAnsi" w:eastAsia="Times New Roman" w:hAnsiTheme="minorHAnsi" w:cstheme="minorHAnsi"/>
-                <w:color w:val="002060"/>
-                <w:sz w:val="18"/>
-                <w:szCs w:val="18"/>
-              </w:rPr>
-              <w:t xml:space="preserve"> y almacenamiento de asistencias.</w:t>
+              <w:t>Requiere integración entre app móvil, backend y almacenamiento de asistencias.</w:t>
             </w:r>
           </w:p>
         </w:tc>
@@ -6866,21 +6469,8 @@
                 <w:sz w:val="18"/>
                 <w:szCs w:val="18"/>
               </w:rPr>
-              <w:t xml:space="preserve">Desarrollo de </w:t>
-            </w:r>
-            <w:proofErr w:type="spellStart"/>
-            <w:r>
-              <w:rPr>
-                <w:rFonts w:asciiTheme="minorHAnsi" w:eastAsia="Times New Roman" w:hAnsiTheme="minorHAnsi" w:cstheme="minorHAnsi"/>
-                <w:b/>
-                <w:bCs/>
-                <w:color w:val="002060"/>
-                <w:sz w:val="18"/>
-                <w:szCs w:val="18"/>
-              </w:rPr>
-              <w:t>dashboard</w:t>
-            </w:r>
-            <w:proofErr w:type="spellEnd"/>
+              <w:t>Desarrollo de dashboard</w:t>
+            </w:r>
           </w:p>
         </w:tc>
         <w:tc>
@@ -6906,27 +6496,7 @@
                 <w:sz w:val="18"/>
                 <w:szCs w:val="18"/>
               </w:rPr>
-              <w:t xml:space="preserve">Implementar dentro de la plataforma Angular un </w:t>
-            </w:r>
-            <w:proofErr w:type="spellStart"/>
-            <w:r>
-              <w:rPr>
-                <w:rFonts w:asciiTheme="minorHAnsi" w:eastAsia="Times New Roman" w:hAnsiTheme="minorHAnsi" w:cstheme="minorHAnsi"/>
-                <w:color w:val="002060"/>
-                <w:sz w:val="18"/>
-                <w:szCs w:val="18"/>
-              </w:rPr>
-              <w:t>dashboard</w:t>
-            </w:r>
-            <w:proofErr w:type="spellEnd"/>
-            <w:r>
-              <w:rPr>
-                <w:rFonts w:asciiTheme="minorHAnsi" w:eastAsia="Times New Roman" w:hAnsiTheme="minorHAnsi" w:cstheme="minorHAnsi"/>
-                <w:color w:val="002060"/>
-                <w:sz w:val="18"/>
-                <w:szCs w:val="18"/>
-              </w:rPr>
-              <w:t xml:space="preserve"> con indicadores relevantes de la operación, servicios y asistencia.</w:t>
+              <w:t>Implementar dentro de la plataforma Angular un dashboard con indicadores relevantes de la operación, servicios y asistencia.</w:t>
             </w:r>
           </w:p>
         </w:tc>
@@ -7393,27 +6963,7 @@
                 <w:sz w:val="18"/>
                 <w:szCs w:val="18"/>
               </w:rPr>
-              <w:t xml:space="preserve">GitHub, Angular, </w:t>
-            </w:r>
-            <w:proofErr w:type="spellStart"/>
-            <w:r>
-              <w:rPr>
-                <w:rFonts w:asciiTheme="minorHAnsi" w:eastAsia="Times New Roman" w:hAnsiTheme="minorHAnsi" w:cstheme="minorHAnsi"/>
-                <w:color w:val="002060"/>
-                <w:sz w:val="18"/>
-                <w:szCs w:val="18"/>
-              </w:rPr>
-              <w:t>Ionic</w:t>
-            </w:r>
-            <w:proofErr w:type="spellEnd"/>
-            <w:r>
-              <w:rPr>
-                <w:rFonts w:asciiTheme="minorHAnsi" w:eastAsia="Times New Roman" w:hAnsiTheme="minorHAnsi" w:cstheme="minorHAnsi"/>
-                <w:color w:val="002060"/>
-                <w:sz w:val="18"/>
-                <w:szCs w:val="18"/>
-              </w:rPr>
-              <w:t>, ASP.NET Core, MySQL, MongoDB</w:t>
+              <w:t>GitHub, Angular, Ionic, ASP.NET Core, MySQL, MongoDB</w:t>
             </w:r>
           </w:p>
         </w:tc>
@@ -7496,27 +7046,7 @@
                 <w:sz w:val="18"/>
                 <w:szCs w:val="18"/>
               </w:rPr>
-              <w:t xml:space="preserve">Pueden surgir ajustes en modelos de datos, </w:t>
-            </w:r>
-            <w:proofErr w:type="spellStart"/>
-            <w:r>
-              <w:rPr>
-                <w:rFonts w:asciiTheme="minorHAnsi" w:eastAsia="Times New Roman" w:hAnsiTheme="minorHAnsi" w:cstheme="minorHAnsi"/>
-                <w:color w:val="002060"/>
-                <w:sz w:val="18"/>
-                <w:szCs w:val="18"/>
-              </w:rPr>
-              <w:t>endpoints</w:t>
-            </w:r>
-            <w:proofErr w:type="spellEnd"/>
-            <w:r>
-              <w:rPr>
-                <w:rFonts w:asciiTheme="minorHAnsi" w:eastAsia="Times New Roman" w:hAnsiTheme="minorHAnsi" w:cstheme="minorHAnsi"/>
-                <w:color w:val="002060"/>
-                <w:sz w:val="18"/>
-                <w:szCs w:val="18"/>
-              </w:rPr>
-              <w:t xml:space="preserve"> o interfaces durante la integración.</w:t>
+              <w:t>Pueden surgir ajustes en modelos de datos, endpoints o interfaces durante la integración.</w:t>
             </w:r>
           </w:p>
         </w:tc>
@@ -7876,7 +7406,6 @@
                 <w:szCs w:val="18"/>
               </w:rPr>
             </w:pPr>
-            <w:proofErr w:type="spellStart"/>
             <w:r>
               <w:rPr>
                 <w:rFonts w:asciiTheme="minorHAnsi" w:eastAsia="Times New Roman" w:hAnsiTheme="minorHAnsi" w:cstheme="minorHAnsi"/>
@@ -7885,37 +7414,7 @@
                 <w:szCs w:val="18"/>
               </w:rPr>
               <w:lastRenderedPageBreak/>
-              <w:t>Notion</w:t>
-            </w:r>
-            <w:proofErr w:type="spellEnd"/>
-            <w:r>
-              <w:rPr>
-                <w:rFonts w:asciiTheme="minorHAnsi" w:eastAsia="Times New Roman" w:hAnsiTheme="minorHAnsi" w:cstheme="minorHAnsi"/>
-                <w:color w:val="002060"/>
-                <w:sz w:val="18"/>
-                <w:szCs w:val="18"/>
-              </w:rPr>
-              <w:t xml:space="preserve">, documentos APT, </w:t>
-            </w:r>
-            <w:proofErr w:type="spellStart"/>
-            <w:r>
-              <w:rPr>
-                <w:rFonts w:asciiTheme="minorHAnsi" w:eastAsia="Times New Roman" w:hAnsiTheme="minorHAnsi" w:cstheme="minorHAnsi"/>
-                <w:color w:val="002060"/>
-                <w:sz w:val="18"/>
-                <w:szCs w:val="18"/>
-              </w:rPr>
-              <w:t>Figma</w:t>
-            </w:r>
-            <w:proofErr w:type="spellEnd"/>
-            <w:r>
-              <w:rPr>
-                <w:rFonts w:asciiTheme="minorHAnsi" w:eastAsia="Times New Roman" w:hAnsiTheme="minorHAnsi" w:cstheme="minorHAnsi"/>
-                <w:color w:val="002060"/>
-                <w:sz w:val="18"/>
-                <w:szCs w:val="18"/>
-              </w:rPr>
-              <w:t>, GitHub, capturas</w:t>
+              <w:t>Notion, documentos APT, Figma, GitHub, capturas</w:t>
             </w:r>
           </w:p>
         </w:tc>
@@ -8370,9 +7869,107 @@
           <w:szCs w:val="24"/>
         </w:rPr>
       </w:pPr>
+      <w:r>
+        <w:rPr>
+          <w:b/>
+          <w:bCs/>
+          <w:sz w:val="24"/>
+          <w:szCs w:val="24"/>
+        </w:rPr>
+        <w:drawing>
+          <wp:inline distT="0" distB="0" distL="0" distR="0" wp14:anchorId="3D14227F" wp14:editId="01FDB7A8">
+            <wp:extent cx="5400040" cy="4420870"/>
+            <wp:effectExtent l="0" t="0" r="0" b="0"/>
+            <wp:docPr id="851159305" name="Imagen 1"/>
+            <wp:cNvGraphicFramePr>
+              <a:graphicFrameLocks xmlns:a="http://schemas.openxmlformats.org/drawingml/2006/main" noChangeAspect="1"/>
+            </wp:cNvGraphicFramePr>
+            <a:graphic xmlns:a="http://schemas.openxmlformats.org/drawingml/2006/main">
+              <a:graphicData uri="http://schemas.openxmlformats.org/drawingml/2006/picture">
+                <pic:pic xmlns:pic="http://schemas.openxmlformats.org/drawingml/2006/picture">
+                  <pic:nvPicPr>
+                    <pic:cNvPr id="851159305" name=""/>
+                    <pic:cNvPicPr/>
+                  </pic:nvPicPr>
+                  <pic:blipFill>
+                    <a:blip r:embed="rId8"/>
+                    <a:stretch>
+                      <a:fillRect/>
+                    </a:stretch>
+                  </pic:blipFill>
+                  <pic:spPr>
+                    <a:xfrm>
+                      <a:off x="0" y="0"/>
+                      <a:ext cx="5400040" cy="4420870"/>
+                    </a:xfrm>
+                    <a:prstGeom prst="rect">
+                      <a:avLst/>
+                    </a:prstGeom>
+                  </pic:spPr>
+                </pic:pic>
+              </a:graphicData>
+            </a:graphic>
+          </wp:inline>
+        </w:drawing>
+      </w:r>
+    </w:p>
+    <w:p>
+      <w:pPr>
+        <w:spacing w:after="0" w:line="360" w:lineRule="auto"/>
+        <w:jc w:val="both"/>
+        <w:rPr>
+          <w:b/>
+          <w:bCs/>
+          <w:sz w:val="24"/>
+          <w:szCs w:val="24"/>
+        </w:rPr>
+      </w:pPr>
+      <w:r>
+        <w:rPr>
+          <w:b/>
+          <w:bCs/>
+          <w:sz w:val="24"/>
+          <w:szCs w:val="24"/>
+        </w:rPr>
+        <w:drawing>
+          <wp:inline distT="0" distB="0" distL="0" distR="0" wp14:anchorId="47779B39" wp14:editId="7575EA3A">
+            <wp:extent cx="5400040" cy="2212975"/>
+            <wp:effectExtent l="0" t="0" r="0" b="0"/>
+            <wp:docPr id="1083077462" name="Imagen 1"/>
+            <wp:cNvGraphicFramePr>
+              <a:graphicFrameLocks xmlns:a="http://schemas.openxmlformats.org/drawingml/2006/main" noChangeAspect="1"/>
+            </wp:cNvGraphicFramePr>
+            <a:graphic xmlns:a="http://schemas.openxmlformats.org/drawingml/2006/main">
+              <a:graphicData uri="http://schemas.openxmlformats.org/drawingml/2006/picture">
+                <pic:pic xmlns:pic="http://schemas.openxmlformats.org/drawingml/2006/picture">
+                  <pic:nvPicPr>
+                    <pic:cNvPr id="1083077462" name=""/>
+                    <pic:cNvPicPr/>
+                  </pic:nvPicPr>
+                  <pic:blipFill>
+                    <a:blip r:embed="rId9"/>
+                    <a:stretch>
+                      <a:fillRect/>
+                    </a:stretch>
+                  </pic:blipFill>
+                  <pic:spPr>
+                    <a:xfrm>
+                      <a:off x="0" y="0"/>
+                      <a:ext cx="5400040" cy="2212975"/>
+                    </a:xfrm>
+                    <a:prstGeom prst="rect">
+                      <a:avLst/>
+                    </a:prstGeom>
+                  </pic:spPr>
+                </pic:pic>
+              </a:graphicData>
+            </a:graphic>
+          </wp:inline>
+        </w:drawing>
+      </w:r>
     </w:p>
     <w:sectPr>
-      <w:headerReference w:type="default" r:id="rId8"/>
+      <w:headerReference w:type="default" r:id="rId10"/>
       <w:pgSz w:w="11906" w:h="16838"/>
       <w:pgMar w:top="1417" w:right="1701" w:bottom="1417" w:left="1701" w:header="708" w:footer="708" w:gutter="0"/>
       <w:pgNumType w:start="1"/>

</xml_diff>